<commit_message>
fix: preserve domain symbol words in report
</commit_message>
<xml_diff>
--- a/docs/weekly_reports/CVS-RFFI_Phase2详细复现报告1_qKNN符号统一版_截至20260817.docx
+++ b/docs/weekly_reports/CVS-RFFI_Phase2详细复现报告1_qKNN符号统一版_截至20260817.docx
@@ -15568,10 +15568,10 @@
           </m:e>
           <m:sub>
             <m:r>
-              <m:t>src</m:t>
+              <m:t>src,src</m:t>
             </m:r>
             <m:r>
-              <m:t>src</m:t>
+              <m:t/>
             </m:r>
           </m:sub>
         </m:sSub>
@@ -15592,10 +15592,10 @@
           </m:e>
           <m:sub>
             <m:r>
-              <m:t>tgt</m:t>
+              <m:t>tgt,tgt</m:t>
             </m:r>
             <m:r>
-              <m:t>tgt</m:t>
+              <m:t/>
             </m:r>
           </m:sub>
         </m:sSub>
@@ -15616,10 +15616,10 @@
           </m:e>
           <m:sub>
             <m:r>
-              <m:t>src</m:t>
+              <m:t>src,tgt</m:t>
             </m:r>
             <m:r>
-              <m:t>tgt</m:t>
+              <m:t/>
             </m:r>
           </m:sub>
         </m:sSub>
@@ -16133,19 +16133,19 @@
               <m:t>src</m:t>
             </m:r>
             <m:r>
-              <m:t>o</m:t>
+              <m:t/>
             </m:r>
             <m:r>
-              <m:t>u</m:t>
+              <m:t/>
             </m:r>
             <m:r>
-              <m:t>r</m:t>
+              <m:t/>
             </m:r>
             <m:r>
-              <m:t>c</m:t>
+              <m:t/>
             </m:r>
             <m:r>
-              <m:t>e</m:t>
+              <m:t/>
             </m:r>
           </m:sup>
         </m:sSubSup>
@@ -16181,19 +16181,19 @@
               <m:t>tgt</m:t>
             </m:r>
             <m:r>
-              <m:t>a</m:t>
+              <m:t/>
             </m:r>
             <m:r>
-              <m:t>r</m:t>
+              <m:t/>
             </m:r>
             <m:r>
-              <m:t>g</m:t>
+              <m:t/>
             </m:r>
             <m:r>
-              <m:t>e</m:t>
+              <m:t/>
             </m:r>
             <m:r>
-              <m:t>tgt</m:t>
+              <m:t/>
             </m:r>
             <m:r>
               <m:rPr>
@@ -16202,7 +16202,7 @@
               <m:t>−</m:t>
             </m:r>
             <m:r>
-              <m:t>src</m:t>
+              <m:t>s</m:t>
             </m:r>
             <m:r>
               <m:t>u</m:t>
@@ -16220,7 +16220,7 @@
               <m:t>r</m:t>
             </m:r>
             <m:r>
-              <m:t>tgt</m:t>
+              <m:t>t</m:t>
             </m:r>
           </m:sup>
         </m:sSubSup>
@@ -16263,7 +16263,7 @@
               <m:t>−</m:t>
             </m:r>
             <m:r>
-              <m:t>src</m:t>
+              <m:t>s</m:t>
             </m:r>
             <m:r>
               <m:t>u</m:t>

</xml_diff>